<commit_message>
Repositorio sin precios: cuota y beca las aporta cada institución
- 02-Datos: se quitan los campos beca y cuota de todas las carreras
  (actual, _V1 y _V2-0) y las notas con montos o la fuente del Excel.
- generar_graficas_ipg.py: beca y cuota son opcionales; si faltan, la
  pieza sale con «DE HASTA 00%» y «$00.000».
- Plantillas: los montos de muestra quedan en cero.
- Documentación y manual .docx: se mantienen las reglas, sin cifras.
- INSTALAR.md: la IA carga beca y cuota desde la base de datos de la
  institución.
</commit_message>
<xml_diff>
--- a/06-Documentacion/Documentacion_Graficas-Admision-IPG-2027.docx
+++ b/06-Documentacion/Documentacion_Graficas-Admision-IPG-2027.docx
@@ -1293,7 +1293,7 @@
         <w:spacing w:after="60"/>
       </w:pPr>
       <w:r>
-        <w:t>La regla de redondeo quedó resuelta (RN-29): a la decena. Se dedujo del post de Ingeniería en Minas, que muestra $82.920 para un cálculo de $82.916,67.</w:t>
+        <w:t xml:space="preserve">La regla de redondeo quedó resuelta (RN-29): a la decena.</w:t>
       </w:r>
     </w:p>
     <w:p>
@@ -6689,7 +6689,7 @@
               <w:rPr>
                 <w:sz w:val="18"/>
               </w:rPr>
-              <w:t>Redondeo de la cuota mensual: a la decena. $82.916,67 → $82.920 y $70.833,33 → $70.830.</w:t>
+              <w:t xml:space="preserve">Redondeo de la cuota mensual: a la decena.</w:t>
             </w:r>
           </w:p>
         </w:tc>
@@ -10828,32 +10828,6 @@
           <w:sz w:val="18"/>
         </w:rPr>
         <w:t xml:space="preserve">      "badges": ["Título Técnico"],</w:t>
-      </w:r>
-    </w:p>
-    <w:p>
-      <w:pPr>
-        <w:spacing w:after="40" w:line="240" w:lineRule="auto"/>
-        <w:ind w:left="340"/>
-      </w:pPr>
-      <w:r>
-        <w:rPr>
-          <w:rFonts w:ascii="Consolas" w:hAnsi="Consolas"/>
-          <w:sz w:val="18"/>
-        </w:rPr>
-        <w:t xml:space="preserve">      "beca": 40,</w:t>
-      </w:r>
-    </w:p>
-    <w:p>
-      <w:pPr>
-        <w:spacing w:after="40" w:line="240" w:lineRule="auto"/>
-        <w:ind w:left="340"/>
-      </w:pPr>
-      <w:r>
-        <w:rPr>
-          <w:rFonts w:ascii="Consolas" w:hAnsi="Consolas"/>
-          <w:sz w:val="18"/>
-        </w:rPr>
-        <w:t xml:space="preserve">      "cuota": 115000,</w:t>
       </w:r>
     </w:p>
     <w:p>

</xml_diff>